<commit_message>
Add detailed information for a new document recipient
Update data models and frontend form to include comprehensive details for the document recipient, including their nationality, marital status, profession, and contact information.

Replit-Commit-Author: Agent
Replit-Commit-Session-Id: 9949a501-27ea-4292-9e04-dbf597b46364
Replit-Commit-Checkpoint-Type: full_checkpoint
Replit-Commit-Event-Id: 4571c62a-bad2-4f6d-a906-0b142c120214
Replit-Commit-Screenshot-Url: https://storage.googleapis.com/screenshot-production-us-central1/9fec3bb4-65ba-4f7f-8388-00f2b841be79/9949a501-27ea-4292-9e04-dbf597b46364/PRDcKmE
Replit-Helium-Checkpoint-Created: true
</commit_message>
<xml_diff>
--- a/templates/template-dec-ciencia-concord.docx
+++ b/templates/template-dec-ciencia-concord.docx
@@ -196,7 +196,7 @@
           <w:b w:val="1"/>
           <w:bCs w:val="1"/>
         </w:rPr>
-        <w:t xml:space="preserve">[Nome] </w:t>
+        <w:t xml:space="preserve">{{nome_cedente}} </w:t>
       </w:r>
       <w:r>
         <w:rPr>
@@ -212,7 +212,7 @@
           <w:b w:val="1"/>
           <w:bCs w:val="1"/>
         </w:rPr>
-        <w:t>[nacionalidade]</w:t>
+        <w:t>{{nacionalidade_cedente}}</w:t>
       </w:r>
       <w:r>
         <w:rPr>
@@ -242,7 +242,7 @@
           <w:szCs w:val="24"/>
           <w:lang w:val="pt-BR"/>
         </w:rPr>
-        <w:t>[Profissão], [Estado Civil],</w:t>
+        <w:t>{{profissao_cedente}}, {{estado_civil_cedente}},</w:t>
       </w:r>
       <w:r>
         <w:rPr>
@@ -276,7 +276,7 @@
           <w:szCs w:val="24"/>
           <w:lang w:val="pt-BR"/>
         </w:rPr>
-        <w:t>[RG]</w:t>
+        <w:t>{{rg_cedente}}</w:t>
       </w:r>
       <w:r>
         <w:rPr>
@@ -312,7 +312,7 @@
         <w:rPr>
           <w:rFonts w:ascii="Arial"/>
         </w:rPr>
-        <w:t>[CPF]</w:t>
+        <w:t>{{cpf_cedente}}</w:t>
       </w:r>
       <w:r>
         <w:rPr>
@@ -324,7 +324,7 @@
         <w:rPr>
           <w:rFonts w:ascii="Arial"/>
         </w:rPr>
-        <w:t>[Data]</w:t>
+        <w:t>{{data_nascimento}}</w:t>
       </w:r>
       <w:r>
         <w:rPr>
@@ -342,7 +342,7 @@
         <w:rPr>
           <w:rFonts w:ascii="Arial"/>
         </w:rPr>
-        <w:t>[Endereço]</w:t>
+        <w:t>{{endereco_cedente}}</w:t>
       </w:r>
       <w:r>
         <w:rPr>
@@ -354,7 +354,7 @@
         <w:rPr>
           <w:rFonts w:ascii="Arial"/>
         </w:rPr>
-        <w:t>: [CEP]</w:t>
+        <w:t>: {{cep_cedente}}</w:t>
       </w:r>
       <w:bookmarkEnd w:id="0"/>
       <w:r>
@@ -415,7 +415,7 @@
           <w:szCs w:val="24"/>
           <w:lang w:val="pt-BR"/>
         </w:rPr>
-        <w:t>[Nome], [Profissão], [Estado Civil],</w:t>
+        <w:t>{{nome_cessionario}}, {{profissao_cessionario}}, {{estado_civil_cessionario}},</w:t>
       </w:r>
       <w:r>
         <w:rPr>
@@ -427,7 +427,7 @@
         <w:rPr>
           <w:color w:val="000000" w:themeColor="text1" w:themeTint="FF" w:themeShade="FF"/>
         </w:rPr>
-        <w:t>[CPF]</w:t>
+        <w:t>{{cpf_cessionario}}</w:t>
       </w:r>
       <w:r>
         <w:rPr>
@@ -439,7 +439,7 @@
         <w:rPr>
           <w:color w:val="000000" w:themeColor="text1" w:themeTint="FF" w:themeShade="FF"/>
         </w:rPr>
-        <w:t xml:space="preserve">[RG] </w:t>
+        <w:t xml:space="preserve">{{rg_cessionario}} </w:t>
       </w:r>
       <w:r>
         <w:rPr>
@@ -461,7 +461,7 @@
           <w:szCs w:val="24"/>
           <w:lang w:val="pt-BR"/>
         </w:rPr>
-        <w:t>[Endereço]</w:t>
+        <w:t>{{endereco_cessionario}}</w:t>
       </w:r>
       <w:r>
         <w:rPr>
@@ -473,7 +473,7 @@
         <w:rPr>
           <w:color w:val="000000" w:themeColor="text1" w:themeTint="FF" w:themeShade="FF"/>
         </w:rPr>
-        <w:t>[CEP]</w:t>
+        <w:t>{{cep_cessionario}}</w:t>
       </w:r>
       <w:r>
         <w:rPr>
@@ -519,7 +519,7 @@
           <w:i w:val="1"/>
           <w:iCs w:val="1"/>
         </w:rPr>
-        <w:t xml:space="preserve">[Número] </w:t>
+        <w:t xml:space="preserve">{{numero_processo}} </w:t>
       </w:r>
       <w:r>
         <w:rPr>
@@ -540,7 +540,7 @@
           <w:b w:val="1"/>
           <w:bCs w:val="1"/>
         </w:rPr>
-        <w:t>[Valor]</w:t>
+        <w:t>{{valor_bruto}}</w:t>
       </w:r>
       <w:r>
         <w:rPr>
@@ -561,7 +561,7 @@
           <w:b w:val="1"/>
           <w:bCs w:val="1"/>
         </w:rPr>
-        <w:t>[Valor].</w:t>
+        <w:t>{{valor_liquido}}.</w:t>
       </w:r>
     </w:p>
     <w:p>
@@ -629,7 +629,7 @@
           <w:b w:val="1"/>
           <w:bCs w:val="1"/>
         </w:rPr>
-        <w:t>[Nome Advogado]</w:t>
+        <w:t>{{nome_advogado}}</w:t>
       </w:r>
       <w:r>
         <w:rPr>
@@ -731,7 +731,7 @@
           <w:b w:val="1"/>
           <w:bCs w:val="1"/>
         </w:rPr>
-        <w:t xml:space="preserve"> [Agência]</w:t>
+        <w:t xml:space="preserve"> {{agencia}}</w:t>
       </w:r>
       <w:r>
         <w:rPr>
@@ -745,7 +745,7 @@
           <w:b w:val="1"/>
           <w:bCs w:val="1"/>
         </w:rPr>
-        <w:t xml:space="preserve"> [Conta]</w:t>
+        <w:t xml:space="preserve"> {{conta}}</w:t>
       </w:r>
       <w:r>
         <w:rPr>
@@ -759,7 +759,7 @@
           <w:b w:val="1"/>
           <w:bCs w:val="1"/>
         </w:rPr>
-        <w:t>[Banco]</w:t>
+        <w:t>{{banco}}</w:t>
       </w:r>
       <w:r>
         <w:rPr>
@@ -917,7 +917,7 @@
           <w:b w:val="1"/>
           <w:bCs w:val="1"/>
         </w:rPr>
-        <w:t>[Nome Cedente]</w:t>
+        <w:t>{{nome_cedente}}</w:t>
       </w:r>
     </w:p>
     <w:p>

</xml_diff>

<commit_message>
Update document generation with comprehensive form and template adjustments
Refactor backend payload model and frontend form for extended document generation, including PIX, editable lawyers, and date/location fields.

Replit-Commit-Author: Agent
Replit-Commit-Session-Id: 9949a501-27ea-4292-9e04-dbf597b46364
Replit-Commit-Checkpoint-Type: full_checkpoint
Replit-Commit-Event-Id: 12e17af5-58fc-4740-8761-bb5f59fae178
Replit-Commit-Screenshot-Url: https://storage.googleapis.com/screenshot-production-us-central1/9fec3bb4-65ba-4f7f-8388-00f2b841be79/9949a501-27ea-4292-9e04-dbf597b46364/tm31rXZ
Replit-Helium-Checkpoint-Created: true
</commit_message>
<xml_diff>
--- a/templates/template-dec-ciencia-concord.docx
+++ b/templates/template-dec-ciencia-concord.docx
@@ -935,7 +935,7 @@
           <w:b w:val="1"/>
           <w:bCs w:val="1"/>
         </w:rPr>
-        <w:t>[CPF]</w:t>
+        <w:t>{{cpf_cedente}}</w:t>
       </w:r>
     </w:p>
     <w:p>
@@ -954,7 +954,7 @@
           <w:b w:val="1"/>
           <w:bCs w:val="1"/>
         </w:rPr>
-        <w:t>[Data]</w:t>
+        <w:t>{{data_nascimento}}</w:t>
       </w:r>
     </w:p>
     <w:p>

</xml_diff>